<commit_message>
S4 L2: Matterport, voz e vídeos passam para o S5; evidências em PDF
- Evidências, guião, plano e CLAUDE.md alinhados com a L1: voz, vídeos,
  planos de pormenor, ilustrações e Matterport no S5
- Atividade e quiz na Udemy (secção 2) marcados como feitos (20/10)
- Atividade «Complete o kit»: retirada a justificação de que a Udemy só
  aceita uma resposta certa (a Udemy parece ter «seleção múltipla»)
- S4_Evidencias_L2_Grupo1.pdf exportado

Co-Authored-By: Claude Opus 5.5 <noreply@anthropic.com>
</commit_message>
<xml_diff>
--- a/Files/P1/L2/S4_Evidencias_L2_Grupo1.docx
+++ b/Files/P1/L2/S4_Evidencias_L2_Grupo1.docx
@@ -730,7 +730,7 @@
                 <w:sz w:val="19"/>
                 <w:szCs w:val="19"/>
               </w:rPr>
-              <w:t xml:space="preserve">Vídeo da L2 em PowerPoint no modelo comum, com a narração nas notas; checklist do kit, ficha da pessoa e plano de apoio em PDF (secção 5). Faltam os planos de pormenor filmados, as ilustrações e a gravação da voz.</w:t>
+              <w:t xml:space="preserve">Vídeo da L2 em PowerPoint no modelo comum, com a narração nas notas; checklist do kit, ficha da pessoa e plano de apoio em PDF (secção 5). Os planos de pormenor, as ilustrações, a voz e o MP4 passam para o S5.</w:t>
             </w:r>
           </w:p>
         </w:tc>
@@ -846,7 +846,7 @@
                 <w:sz w:val="19"/>
                 <w:szCs w:val="19"/>
               </w:rPr>
-              <w:t xml:space="preserve">Integração definida: «Caça ao kit» com 8 tags, roteiro de 6 paragens e lugar reservado no vídeo (secção 6). Falta o espaço e a gravação.</w:t>
+              <w:t xml:space="preserve">Integração definida: «Caça ao kit» com 8 tags, roteiro de 6 paragens e lugar reservado no vídeo (secção 6). A captura da casa e a gravação da visita passam para o S5 (a decidir com o grupo).</w:t>
             </w:r>
           </w:p>
         </w:tc>
@@ -924,45 +924,45 @@
                 <w:sz w:val="19"/>
                 <w:szCs w:val="19"/>
               </w:rPr>
-              <w:t xml:space="preserve">Em curso</w:t>
-            </w:r>
-          </w:p>
-        </w:tc>
-        <w:tc>
-          <w:tcPr>
-            <w:tcW w:w="0" w:type="auto"/>
-            <w:tcBorders>
-              <w:top w:val="single" w:sz="6" w:space="0" w:color="BBBBBB"/>
-              <w:left w:val="single" w:sz="6" w:space="0" w:color="BBBBBB"/>
-              <w:bottom w:val="single" w:sz="6" w:space="0" w:color="BBBBBB"/>
-              <w:right w:val="single" w:sz="6" w:space="0" w:color="BBBBBB"/>
-            </w:tcBorders>
-            <w:tcMar>
-              <w:top w:w="60" w:type="dxa"/>
-              <w:left w:w="100" w:type="dxa"/>
-              <w:bottom w:w="60" w:type="dxa"/>
-              <w:right w:w="100" w:type="dxa"/>
-            </w:tcMar>
-            <w:hideMark/>
-          </w:tcPr>
-          <w:p>
-            <w:pPr>
-              <w:spacing w:before="80" w:after="160"/>
-              <w:rPr>
-                <w:rFonts w:ascii="Segoe UI" w:eastAsia="Times New Roman" w:hAnsi="Segoe UI" w:cs="Segoe UI"/>
-                <w:color w:val="2B2B2B"/>
-                <w:sz w:val="19"/>
-                <w:szCs w:val="19"/>
-              </w:rPr>
-            </w:pPr>
-            <w:r>
-              <w:rPr>
-                <w:rFonts w:ascii="Segoe UI" w:eastAsia="Times New Roman" w:hAnsi="Segoe UI" w:cs="Segoe UI"/>
-                <w:color w:val="2B2B2B"/>
-                <w:sz w:val="19"/>
-                <w:szCs w:val="19"/>
-              </w:rPr>
-              <w:t xml:space="preserve">Atividade «Complete o kit» com autocorreção e quiz de 4 perguntas com feedback por opção (secção 7). Falta criá-los na Udemy.</w:t>
+              <w:t xml:space="preserve">Feito</w:t>
+            </w:r>
+          </w:p>
+        </w:tc>
+        <w:tc>
+          <w:tcPr>
+            <w:tcW w:w="0" w:type="auto"/>
+            <w:tcBorders>
+              <w:top w:val="single" w:sz="6" w:space="0" w:color="BBBBBB"/>
+              <w:left w:val="single" w:sz="6" w:space="0" w:color="BBBBBB"/>
+              <w:bottom w:val="single" w:sz="6" w:space="0" w:color="BBBBBB"/>
+              <w:right w:val="single" w:sz="6" w:space="0" w:color="BBBBBB"/>
+            </w:tcBorders>
+            <w:tcMar>
+              <w:top w:w="60" w:type="dxa"/>
+              <w:left w:w="100" w:type="dxa"/>
+              <w:bottom w:w="60" w:type="dxa"/>
+              <w:right w:w="100" w:type="dxa"/>
+            </w:tcMar>
+            <w:hideMark/>
+          </w:tcPr>
+          <w:p>
+            <w:pPr>
+              <w:spacing w:before="80" w:after="160"/>
+              <w:rPr>
+                <w:rFonts w:ascii="Segoe UI" w:eastAsia="Times New Roman" w:hAnsi="Segoe UI" w:cs="Segoe UI"/>
+                <w:color w:val="2B2B2B"/>
+                <w:sz w:val="19"/>
+                <w:szCs w:val="19"/>
+              </w:rPr>
+            </w:pPr>
+            <w:r>
+              <w:rPr>
+                <w:rFonts w:ascii="Segoe UI" w:eastAsia="Times New Roman" w:hAnsi="Segoe UI" w:cs="Segoe UI"/>
+                <w:color w:val="2B2B2B"/>
+                <w:sz w:val="19"/>
+                <w:szCs w:val="19"/>
+              </w:rPr>
+              <w:t xml:space="preserve">Atividade «Complete o kit» com autocorreção e quiz de 4 perguntas com feedback por opção (secção 7). Já criados na Udemy (secção 2), com os 3 PDFs como recursos; a rever no S5.</w:t>
             </w:r>
           </w:p>
         </w:tc>
@@ -1135,7 +1135,7 @@
           <w:sz w:val="21"/>
           <w:szCs w:val="21"/>
         </w:rPr>
-        <w:t xml:space="preserve"> pela checklist: o quiz da Udemy só aceita uma resposta certa por pergunta.</w:t>
+        <w:t xml:space="preserve"> pela checklist: o cuidador escolhe os itens, confirma-os e leva a lista para montar o kit em casa, junto com a ficha da pessoa e o plano de apoio.</w:t>
       </w:r>
     </w:p>
     <w:p>
@@ -1184,6 +1184,50 @@
           <w:szCs w:val="21"/>
         </w:rPr>
         <w:t xml:space="preserve">Os três recursos do S3 (checklist, ficha da pessoa, plano de apoio) já estão feitos em PDF.</w:t>
+      </w:r>
+    </w:p>
+    <w:p>
+      <w:pPr>
+        <w:numPr>
+          <w:ilvl w:val="0"/>
+          <w:numId w:val="1"/>
+        </w:numPr>
+        <w:spacing w:before="100" w:beforeAutospacing="1" w:after="100" w:afterAutospacing="1"/>
+        <w:rPr>
+          <w:rFonts w:ascii="Segoe UI" w:eastAsia="Times New Roman" w:hAnsi="Segoe UI" w:cs="Segoe UI"/>
+          <w:color w:val="2B2B2B"/>
+          <w:sz w:val="21"/>
+          <w:szCs w:val="21"/>
+        </w:rPr>
+      </w:pPr>
+      <w:r>
+        <w:rPr>
+          <w:rFonts w:ascii="Segoe UI" w:eastAsia="Times New Roman" w:hAnsi="Segoe UI" w:cs="Segoe UI"/>
+          <w:color w:val="2B2B2B"/>
+          <w:sz w:val="21"/>
+          <w:szCs w:val="21"/>
+        </w:rPr>
+        <w:t xml:space="preserve">Como na L1: </w:t>
+      </w:r>
+      <w:r>
+        <w:rPr>
+          <w:rFonts w:ascii="Segoe UI" w:eastAsia="Times New Roman" w:hAnsi="Segoe UI" w:cs="Segoe UI"/>
+          <w:b/>
+          <w:bCs/>
+          <w:color w:val="2B2B2B"/>
+          <w:sz w:val="21"/>
+          <w:szCs w:val="21"/>
+        </w:rPr>
+        <w:t xml:space="preserve">a voz, os vídeos, as ilustrações, os planos de pormenor e o Matterport passam para o S5</w:t>
+      </w:r>
+      <w:r>
+        <w:rPr>
+          <w:rFonts w:ascii="Segoe UI" w:eastAsia="Times New Roman" w:hAnsi="Segoe UI" w:cs="Segoe UI"/>
+          <w:color w:val="2B2B2B"/>
+          <w:sz w:val="21"/>
+          <w:szCs w:val="21"/>
+        </w:rPr>
+        <w:t xml:space="preserve">.</w:t>
       </w:r>
     </w:p>
     <w:p>
@@ -3771,7 +3815,7 @@
           <w:sz w:val="21"/>
           <w:szCs w:val="21"/>
         </w:rPr>
-        <w:t xml:space="preserve">Cada cena corresponde a um diapositivo do vídeo (PowerPoint → vídeo Full HD 1080p, narração nas notas de cada diapositivo). Os retângulos tracejados marcam onde ficam as ilustrações planas e os planos de pormenor filmados, que estão em produção.</w:t>
+        <w:t xml:space="preserve">Cada cena corresponde a um diapositivo do vídeo (PowerPoint → vídeo Full HD 1080p, narração nas notas de cada diapositivo). Os retângulos tracejados marcam onde ficam as ilustrações planas e os planos de pormenor filmados, que passam para o S5.</w:t>
       </w:r>
     </w:p>
     <w:tbl>
@@ -5052,7 +5096,7 @@
                 <w:sz w:val="19"/>
                 <w:szCs w:val="19"/>
               </w:rPr>
-              <w:t>Planos de pormenor dos objetos do kit: (a acrescentar)</w:t>
+              <w:t>Planos de pormenor dos objetos do kit: filmagem no S5</w:t>
             </w:r>
           </w:p>
         </w:tc>
@@ -5446,7 +5490,7 @@
                 <w:sz w:val="19"/>
                 <w:szCs w:val="19"/>
               </w:rPr>
-              <w:t xml:space="preserve">Diapositivos e narração feitos; falta gravar</w:t>
+              <w:t xml:space="preserve">Diapositivos e narração feitos; gravar no S5</w:t>
             </w:r>
           </w:p>
         </w:tc>
@@ -5562,7 +5606,7 @@
                 <w:sz w:val="19"/>
                 <w:szCs w:val="19"/>
               </w:rPr>
-              <w:t xml:space="preserve">Texto final nas notas; teste de áudio por fazer</w:t>
+              <w:t xml:space="preserve">Texto final nas notas; teste de áudio e gravação no S5</w:t>
             </w:r>
           </w:p>
         </w:tc>
@@ -5678,7 +5722,7 @@
                 <w:sz w:val="19"/>
                 <w:szCs w:val="19"/>
               </w:rPr>
-              <w:t xml:space="preserve">Por filmar</w:t>
+              <w:t xml:space="preserve">Filmar no S5</w:t>
             </w:r>
           </w:p>
         </w:tc>
@@ -5794,7 +5838,7 @@
                 <w:sz w:val="19"/>
                 <w:szCs w:val="19"/>
               </w:rPr>
-              <w:t xml:space="preserve">Por escolher</w:t>
+              <w:t xml:space="preserve">A escolher no S5</w:t>
             </w:r>
           </w:p>
         </w:tc>
@@ -5910,7 +5954,7 @@
                 <w:sz w:val="19"/>
                 <w:szCs w:val="19"/>
               </w:rPr>
-              <w:t xml:space="preserve">Link: (a acrescentar)</w:t>
+              <w:t xml:space="preserve">S5 (depois de gravada a voz)</w:t>
             </w:r>
           </w:p>
         </w:tc>
@@ -7456,7 +7500,7 @@
           <w:sz w:val="21"/>
           <w:szCs w:val="21"/>
         </w:rPr>
-        <w:t xml:space="preserve">o grupo decide que casa capturar e quando; até lá, o diapositivo 6 fica como lugar reservado. Plano B: um espaço do Matterport Discover, gravado, com capturas anotadas onde ficariam as tags.</w:t>
+        <w:t xml:space="preserve">o grupo decide que casa capturar e quando; até lá, o diapositivo 6 fica como lugar reservado.</w:t>
       </w:r>
     </w:p>
     <w:p>
@@ -7627,7 +7671,7 @@
           <w:sz w:val="21"/>
           <w:szCs w:val="21"/>
         </w:rPr>
-        <w:t xml:space="preserve">percorra a casa da D. Rosa e encontre os itens do kit antes de ver a checklist. (link a acrescentar)</w:t>
+        <w:t xml:space="preserve">percorra a casa da D. Rosa e encontre os itens do kit antes de ver a checklist. (link no S5)</w:t>
       </w:r>
     </w:p>
     <w:p>
@@ -8278,7 +8322,7 @@
           <w:sz w:val="21"/>
           <w:szCs w:val="21"/>
         </w:rPr>
-        <w:t xml:space="preserve">Captura do quiz na Udemy (vista de aluno): </w:t>
+        <w:t xml:space="preserve">Estado: </w:t>
       </w:r>
       <w:r>
         <w:rPr>
@@ -8287,7 +8331,7 @@
           <w:sz w:val="21"/>
           <w:szCs w:val="21"/>
         </w:rPr>
-        <w:t xml:space="preserve">(a acrescentar)</w:t>
+        <w:t xml:space="preserve">atividade (com os 3 PDFs como recursos) e quiz já criados na Udemy (secção 2, aulas 2.2 e 2.3); a rever no S5.</w:t>
       </w:r>
     </w:p>
     <w:p>
@@ -8325,7 +8369,7 @@
           <w:sz w:val="21"/>
           <w:szCs w:val="21"/>
         </w:rPr>
-        <w:t xml:space="preserve">Filmar os planos de pormenor e fazer as ilustrações planas; gravar a voz e exportar os dois vídeos em 1080p.</w:t>
+        <w:t xml:space="preserve">Filmar os planos de pormenor e fazer as ilustrações planas; escolher a música; teste de áudio, gravar a voz e exportar os dois vídeos em 1080p.</w:t>
       </w:r>
     </w:p>
     <w:p>
@@ -8349,7 +8393,7 @@
           <w:sz w:val="21"/>
           <w:szCs w:val="21"/>
         </w:rPr>
-        <w:t xml:space="preserve">Atividade, recursos em PDF e quiz criados na Udemy (secção 2) e testados como aluno.</w:t>
+        <w:t xml:space="preserve">Rever a atividade e o quiz na Udemy (já criados) e testar como aluno. Se o editor tiver «seleção múltipla», a escolha dos 8 itens do kit pode passar a ter correção automática.</w:t>
       </w:r>
     </w:p>
     <w:p>

</xml_diff>

<commit_message>
S4 L2: secção 2 criada na Udemy (Aulas 5–8 + Teste 2)
- Guião, plano, evidências e CLAUDE.md com a estrutura real da Udemy,
  igual à da L1: gancho → conteúdo → atividade → quiz → síntese
- Aula 7 (artigo + 3 PDFs) e Teste 2 (4 perguntas) feitos a 20/10
- Evidências: captura da secção 2 na Udemy; PDF exportado (13 páginas)

Co-Authored-By: Claude Opus 5.5 <noreply@anthropic.com>
</commit_message>
<xml_diff>
--- a/Files/P1/L2/S4_Evidencias_L2_Grupo1.docx
+++ b/Files/P1/L2/S4_Evidencias_L2_Grupo1.docx
@@ -962,7 +962,7 @@
                 <w:sz w:val="19"/>
                 <w:szCs w:val="19"/>
               </w:rPr>
-              <w:t xml:space="preserve">Atividade «Complete o kit» com autocorreção e quiz de 4 perguntas com feedback por opção (secção 7). Já criados na Udemy (secção 2), com os 3 PDFs como recursos; a rever no S5.</w:t>
+              <w:t xml:space="preserve">Atividade «Complete o kit» com autocorreção e quiz de 4 perguntas com feedback por opção (secção 7). Já criados na Udemy (secção 2: Aula 7 e Teste 2), com os 3 PDFs como recursos; a rever no S5.</w:t>
             </w:r>
           </w:p>
         </w:tc>
@@ -1091,7 +1091,27 @@
           <w:sz w:val="21"/>
           <w:szCs w:val="21"/>
         </w:rPr>
-        <w:t xml:space="preserve">A lição fica com 4 aulas na Udemy: vídeo (≈ 4 min) → atividade → quiz → vídeo de síntese (≈ 30 s).</w:t>
+        <w:t xml:space="preserve">Na Udemy, a L2 é a secção 2, com </w:t>
+      </w:r>
+      <w:r>
+        <w:rPr>
+          <w:rFonts w:ascii="Segoe UI" w:eastAsia="Times New Roman" w:hAnsi="Segoe UI" w:cs="Segoe UI"/>
+          <w:b/>
+          <w:bCs/>
+          <w:color w:val="2B2B2B"/>
+          <w:sz w:val="21"/>
+          <w:szCs w:val="21"/>
+        </w:rPr>
+        <w:t xml:space="preserve">5 itens, como a L1</w:t>
+      </w:r>
+      <w:r>
+        <w:rPr>
+          <w:rFonts w:ascii="Segoe UI" w:eastAsia="Times New Roman" w:hAnsi="Segoe UI" w:cs="Segoe UI"/>
+          <w:color w:val="2B2B2B"/>
+          <w:sz w:val="21"/>
+          <w:szCs w:val="21"/>
+        </w:rPr>
+        <w:t xml:space="preserve">: gancho (Aula 5) → conteúdo (Aula 6) → atividade (Aula 7) → quiz (Teste 2) → síntese (Aula 8).</w:t>
       </w:r>
     </w:p>
     <w:p>
@@ -3411,7 +3431,7 @@
                 <w:sz w:val="19"/>
                 <w:szCs w:val="19"/>
               </w:rPr>
-              <w:t xml:space="preserve">0:00–0:15 (vídeo 2.4)</w:t>
+              <w:t xml:space="preserve">0:00–0:15 (Aula 8)</w:t>
             </w:r>
           </w:p>
         </w:tc>
@@ -3740,7 +3760,7 @@
           <w:sz w:val="21"/>
           <w:szCs w:val="21"/>
         </w:rPr>
-        <w:t xml:space="preserve">≈ 490 palavras → vídeo 2.1 ≈ 4 min 15 s (incluindo ≈ 40 s de visita 3D); vídeo 2.4 ≈ 30 s. Com a atividade (2 min) e o quiz (1,5 min), a lição tem ≈ 8 min. Se a voz sair mais lenta, cortar primeiro na cena 3d, não no kit.</w:t>
+        <w:t xml:space="preserve">≈ 490 palavras → Aulas 5 + 6 ≈ 4 min 15 s (gancho ≈ 45 s + conteúdo ≈ 3 min 30 s, incluindo ≈ 40 s de visita 3D); Aula 8 ≈ 30 s. Com a atividade (2 min) e o quiz (1,5 min), a lição tem ≈ 8 min. Se a voz sair mais lenta, cortar primeiro na cena 3d, não no kit.</w:t>
       </w:r>
     </w:p>
     <w:p>
@@ -4638,7 +4658,7 @@
                 <w:rStyle w:val="cap1"/>
                 <w:rFonts w:ascii="Segoe UI" w:eastAsia="Times New Roman" w:hAnsi="Segoe UI" w:cs="Segoe UI"/>
               </w:rPr>
-              <w:t>10 · Síntese (vídeo 2.4)</w:t>
+              <w:t>10 · Síntese (Aula 8)</w:t>
             </w:r>
           </w:p>
         </w:tc>
@@ -4800,7 +4820,7 @@
         <w:rPr>
           <w:rFonts w:ascii="Segoe UI" w:eastAsia="Times New Roman" w:hAnsi="Segoe UI" w:cs="Segoe UI"/>
         </w:rPr>
-        <w:t>Recursos para descarregar (aula 2.2)</w:t>
+        <w:t>Recursos para descarregar (Aula 7)</w:t>
       </w:r>
     </w:p>
     <w:tbl>
@@ -5414,7 +5434,7 @@
                 <w:sz w:val="19"/>
                 <w:szCs w:val="19"/>
               </w:rPr>
-              <w:t xml:space="preserve">Vídeo 2.1 (≈ 4 min) e 2.4 (≈ 30 s)</w:t>
+              <w:t xml:space="preserve">Vídeos das Aulas 5, 6 e 8 (≈ 4 min 15 s + 30 s)</w:t>
             </w:r>
           </w:p>
         </w:tc>
@@ -6002,7 +6022,7 @@
           <w:sz w:val="21"/>
           <w:szCs w:val="21"/>
         </w:rPr>
-        <w:t xml:space="preserve">a casa fictícia da D. Rosa e da Ana, capturada pelo grupo com a app Matterport Capture (fio condutor das 5 lições). Na Udemy (sem iframes) a visita entra como vídeo gravado (≈ 40 s, diapositivo 6) e como link «Visita 3D» opcional nos recursos da aula 2.2.</w:t>
+        <w:t xml:space="preserve">a casa fictícia da D. Rosa e da Ana, capturada pelo grupo com a app Matterport Capture (fio condutor das 5 lições). Na Udemy (sem iframes) a visita entra como vídeo gravado (≈ 40 s, diapositivo 6) e como link «Visita 3D» opcional nos recursos da Aula 7.</w:t>
       </w:r>
     </w:p>
     <w:p>
@@ -7538,7 +7558,7 @@
         <w:rPr>
           <w:rFonts w:ascii="Segoe UI" w:eastAsia="Times New Roman" w:hAnsi="Segoe UI" w:cs="Segoe UI"/>
         </w:rPr>
-        <w:t>Atividade «Complete o kit» (aula 2.2)</w:t>
+        <w:t>Atividade «Complete o kit» (Aula 7)</w:t>
       </w:r>
     </w:p>
     <w:p>
@@ -7716,7 +7736,7 @@
         <w:rPr>
           <w:rFonts w:ascii="Segoe UI" w:eastAsia="Times New Roman" w:hAnsi="Segoe UI" w:cs="Segoe UI"/>
         </w:rPr>
-        <w:t>Quiz (aula 2.3)</w:t>
+        <w:t>Quiz (Teste 2)</w:t>
       </w:r>
     </w:p>
     <w:p>
@@ -8300,7 +8320,7 @@
           <w:sz w:val="21"/>
           <w:szCs w:val="21"/>
         </w:rPr>
-        <w:t xml:space="preserve">P1–P3 cobrem os objetivos 1 e 2 (kit e ficha da pessoa); a P4 cobre o objetivo 3 (plano de apoio para o cuidador). A atividade da aula 2.2 completa o objetivo 1 com a escolha dos itens.</w:t>
+        <w:t xml:space="preserve">P1–P3 cobrem os objetivos 1 e 2 (kit e ficha da pessoa); a P4 cobre o objetivo 3 (plano de apoio para o cuidador). A atividade da Aula 7 completa o objetivo 1 com a escolha dos itens.</w:t>
       </w:r>
     </w:p>
     <w:p>
@@ -8331,7 +8351,77 @@
           <w:sz w:val="21"/>
           <w:szCs w:val="21"/>
         </w:rPr>
-        <w:t xml:space="preserve">atividade (com os 3 PDFs como recursos) e quiz já criados na Udemy (secção 2, aulas 2.2 e 2.3); a rever no S5.</w:t>
+        <w:t xml:space="preserve">atividade (Aula 7: artigo com os 3 PDFs para descarregar) e quiz (Teste 2: 4 perguntas de escolha múltipla) já criados na Udemy, na secção 2 «Preparar antes»; os vídeos das Aulas 5, 6 e 8 entram no S5. A rever no S5.</w:t>
+      </w:r>
+    </w:p>
+    <w:p>
+      <w:pPr>
+        <w:pStyle w:val="NormalWeb"/>
+        <w:keepNext/>
+        <w:jc w:val="center"/>
+        <w:rPr>
+          <w:rFonts w:ascii="Segoe UI" w:hAnsi="Segoe UI" w:cs="Segoe UI"/>
+          <w:color w:val="2B2B2B"/>
+          <w:sz w:val="21"/>
+          <w:szCs w:val="21"/>
+        </w:rPr>
+      </w:pPr>
+      <w:r>
+        <w:drawing>
+          <wp:inline xmlns:a="http://schemas.openxmlformats.org/drawingml/2006/main" xmlns:pic="http://schemas.openxmlformats.org/drawingml/2006/picture">
+            <wp:extent cx="3780000" cy="3794955"/>
+            <wp:docPr id="1" name="Picture 1"/>
+            <wp:cNvGraphicFramePr>
+              <a:graphicFrameLocks noChangeAspect="1"/>
+            </wp:cNvGraphicFramePr>
+            <a:graphic>
+              <a:graphicData uri="http://schemas.openxmlformats.org/drawingml/2006/picture">
+                <pic:pic>
+                  <pic:nvPicPr>
+                    <pic:cNvPr id="0" name="udemy_s2.png"/>
+                    <pic:cNvPicPr/>
+                  </pic:nvPicPr>
+                  <pic:blipFill>
+                    <a:blip r:embed="rId32"/>
+                    <a:stretch>
+                      <a:fillRect/>
+                    </a:stretch>
+                  </pic:blipFill>
+                  <pic:spPr>
+                    <a:xfrm>
+                      <a:off x="0" y="0"/>
+                      <a:ext cx="3780000" cy="3794955"/>
+                    </a:xfrm>
+                    <a:prstGeom prst="rect"/>
+                  </pic:spPr>
+                </pic:pic>
+              </a:graphicData>
+            </a:graphic>
+          </wp:inline>
+        </w:drawing>
+      </w:r>
+    </w:p>
+    <w:p>
+      <w:pPr>
+        <w:pStyle w:val="NormalWeb"/>
+        <w:jc w:val="center"/>
+        <w:rPr>
+          <w:rFonts w:ascii="Segoe UI" w:hAnsi="Segoe UI" w:cs="Segoe UI"/>
+          <w:color w:val="2B2B2B"/>
+          <w:sz w:val="21"/>
+          <w:szCs w:val="21"/>
+        </w:rPr>
+      </w:pPr>
+      <w:r>
+        <w:rPr>
+          <w:rFonts w:ascii="Segoe UI" w:hAnsi="Segoe UI" w:cs="Segoe UI"/>
+          <w:i/>
+          <w:iCs/>
+          <w:color w:val="2B2B2B"/>
+          <w:sz w:val="21"/>
+          <w:szCs w:val="21"/>
+        </w:rPr>
+        <w:t xml:space="preserve">Secção 2 «Preparar antes» na Udemy (vista de instrutor, 20/10/2026)</w:t>
       </w:r>
     </w:p>
     <w:p>

</xml_diff>